<commit_message>
docs(ux): onboarding wizard Reuse & Coverage Audit + platform-coverage update
Audits 18 capability areas against the live platform (engines + tables + screens): ~14
already implemented & reusable, ~4 partial, 0 missing. Key finding: an existing
setup-wizard.ts (business profiles/modules/role seed) + screens for import, integrations,
workflows/templates, uom, permissions, territory/routes/journey, suppliers, approvals,
einvoice, modules. Adds: 17-step Core+Advanced wizard mapped to existing capabilities;
Existing Platform Reuse Map; Template Differences (Cash Van/Pre-Sales/Distribution/
Pharmacy/Retail/Custom); Implementation Readiness (wire-now / UI-exposure / backend /
future). Onboarding = orchestration+exposure layer, not new isolated features. Design only.

Co-Authored-By: Claude Opus 4.8 (1M context) <noreply@anthropic.com>
Claude-Session: https://claude.ai/code/session_01AnB42F2fTvBjmAfvzDNk4V
</commit_message>
<xml_diff>
--- a/docs/audits/Onboarding-Wizard-UX-Design-2026.docx
+++ b/docs/audits/Onboarding-Wizard-UX-Design-2026.docx
@@ -13,7 +13,7 @@
           <w:color w:val="1F497D"/>
           <w:sz w:val="52"/>
         </w:rPr>
-        <w:t>Company Onboarding Wizard — UX &amp; Product Design</w:t>
+        <w:t>Company Onboarding Wizard — UX &amp; Product Design (+ Reuse &amp; Coverage Audit)</w:t>
       </w:r>
     </w:p>
     <w:p>
@@ -2351,6 +2351,3143 @@
     </w:p>
     <w:p>
       <w:pPr>
+        <w:pStyle w:val="Heading1"/>
+      </w:pPr>
+      <w:r>
+        <w:rPr>
+          <w:color w:val="1F497D"/>
+        </w:rPr>
+        <w:t>Part II — Reuse &amp; Coverage Audit (extend, don't rebuild)</w:t>
+      </w:r>
+    </w:p>
+    <w:p>
+      <w:r>
+        <w:rPr>
+          <w:b/>
+        </w:rPr>
+        <w:t>Finding:</w:t>
+      </w:r>
+      <w:r>
+        <w:t xml:space="preserve"> the platform already has engines, tables, </w:t>
+      </w:r>
+      <w:r>
+        <w:rPr>
+          <w:b/>
+        </w:rPr>
+        <w:t>and screens</w:t>
+      </w:r>
+      <w:r>
+        <w:t xml:space="preserve"> for almost every</w:t>
+      </w:r>
+    </w:p>
+    <w:p>
+      <w:r>
+        <w:t xml:space="preserve">onboarding area — including an existing </w:t>
+      </w:r>
+      <w:r>
+        <w:rPr>
+          <w:b/>
+        </w:rPr>
+        <w:t>`setup-wizard.ts`</w:t>
+      </w:r>
+      <w:r>
+        <w:t xml:space="preserve"> (per-business-type profiles,</w:t>
+      </w:r>
+    </w:p>
+    <w:p>
+      <w:r>
+        <w:t xml:space="preserve">module toggles, auto-seeded roles via </w:t>
+      </w:r>
+      <w:r>
+        <w:rPr>
+          <w:rFonts w:ascii="Consolas" w:hAnsi="Consolas"/>
+          <w:sz w:val="19"/>
+        </w:rPr>
+        <w:t>erp_apply_setup_modules</w:t>
+      </w:r>
+      <w:r>
+        <w:t xml:space="preserve"> / </w:t>
+      </w:r>
+      <w:r>
+        <w:rPr>
+          <w:rFonts w:ascii="Consolas" w:hAnsi="Consolas"/>
+          <w:sz w:val="19"/>
+        </w:rPr>
+        <w:t>erp_seed_company_roles</w:t>
+      </w:r>
+      <w:r>
+        <w:t>).</w:t>
+      </w:r>
+    </w:p>
+    <w:p>
+      <w:r>
+        <w:rPr>
+          <w:b/>
+        </w:rPr>
+        <w:t>The onboarding wizard is primarily an ORCHESTRATION + EXPOSURE layer</w:t>
+      </w:r>
+      <w:r>
+        <w:t xml:space="preserve"> that walks the</w:t>
+      </w:r>
+    </w:p>
+    <w:p>
+      <w:r>
+        <w:t>admin through existing screens/engines in a guided, business-friendly order — not a set of</w:t>
+      </w:r>
+    </w:p>
+    <w:p>
+      <w:r>
+        <w:t>new isolated features.</w:t>
+      </w:r>
+    </w:p>
+    <w:p>
+      <w:pPr>
+        <w:pStyle w:val="Heading2"/>
+      </w:pPr>
+      <w:r>
+        <w:rPr>
+          <w:color w:val="1F497D"/>
+        </w:rPr>
+        <w:t>1–2. Capability audit &amp; classification</w:t>
+      </w:r>
+    </w:p>
+    <w:p>
+      <w:r>
+        <w:t>Legend: ✅ Implemented &amp; reusable · ◐ Partial · ✎ Designed-not-implemented · ✗ Missing.</w:t>
+      </w:r>
+    </w:p>
+    <w:tbl>
+      <w:tblPr>
+        <w:tblStyle w:val="LightGrid-Accent1"/>
+        <w:tblW w:type="auto" w:w="0"/>
+        <w:jc w:val="center"/>
+        <w:tblLook w:firstColumn="1" w:firstRow="1" w:lastColumn="0" w:lastRow="0" w:noHBand="0" w:noVBand="1" w:val="04A0"/>
+      </w:tblPr>
+      <w:tblGrid>
+        <w:gridCol w:w="2880"/>
+        <w:gridCol w:w="2880"/>
+        <w:gridCol w:w="2880"/>
+      </w:tblGrid>
+      <w:tr>
+        <w:tc>
+          <w:tcPr>
+            <w:tcW w:type="dxa" w:w="2880"/>
+            <w:shd w:val="clear" w:fill="1F497D"/>
+          </w:tcPr>
+          <w:p>
+            <w:r>
+              <w:rPr>
+                <w:b/>
+                <w:color w:val="FFFFFF"/>
+              </w:rPr>
+              <w:t>Capability</w:t>
+            </w:r>
+          </w:p>
+        </w:tc>
+        <w:tc>
+          <w:tcPr>
+            <w:tcW w:type="dxa" w:w="2880"/>
+            <w:shd w:val="clear" w:fill="1F497D"/>
+          </w:tcPr>
+          <w:p>
+            <w:r>
+              <w:rPr>
+                <w:b/>
+                <w:color w:val="FFFFFF"/>
+              </w:rPr>
+              <w:t>Status</w:t>
+            </w:r>
+          </w:p>
+        </w:tc>
+        <w:tc>
+          <w:tcPr>
+            <w:tcW w:type="dxa" w:w="2880"/>
+            <w:shd w:val="clear" w:fill="1F497D"/>
+          </w:tcPr>
+          <w:p>
+            <w:r>
+              <w:rPr>
+                <w:b/>
+                <w:color w:val="FFFFFF"/>
+              </w:rPr>
+              <w:t>Existing engine / screen</w:t>
+            </w:r>
+          </w:p>
+        </w:tc>
+      </w:tr>
+      <w:tr>
+        <w:tc>
+          <w:tcPr>
+            <w:tcW w:type="dxa" w:w="2880"/>
+          </w:tcPr>
+          <w:p>
+            <w:r>
+              <w:t>Import jobs / Excel / CSV</w:t>
+            </w:r>
+          </w:p>
+        </w:tc>
+        <w:tc>
+          <w:tcPr>
+            <w:tcW w:type="dxa" w:w="2880"/>
+          </w:tcPr>
+          <w:p>
+            <w:r>
+              <w:t>✅</w:t>
+            </w:r>
+          </w:p>
+        </w:tc>
+        <w:tc>
+          <w:tcPr>
+            <w:tcW w:type="dxa" w:w="2880"/>
+          </w:tcPr>
+          <w:p>
+            <w:r>
+              <w:rPr>
+                <w:rFonts w:ascii="Consolas" w:hAnsi="Consolas"/>
+                <w:sz w:val="19"/>
+              </w:rPr>
+              <w:t>erp_import_jobs</w:t>
+            </w:r>
+            <w:r>
+              <w:t xml:space="preserve">, </w:t>
+            </w:r>
+            <w:r>
+              <w:rPr>
+                <w:rFonts w:ascii="Consolas" w:hAnsi="Consolas"/>
+                <w:sz w:val="19"/>
+              </w:rPr>
+              <w:t>erp_import_mappings</w:t>
+            </w:r>
+            <w:r>
+              <w:t xml:space="preserve">; </w:t>
+            </w:r>
+            <w:r>
+              <w:rPr>
+                <w:rFonts w:ascii="Consolas" w:hAnsi="Consolas"/>
+                <w:sz w:val="19"/>
+              </w:rPr>
+              <w:t>settings/import</w:t>
+            </w:r>
+            <w:r>
+              <w:t xml:space="preserve">, </w:t>
+            </w:r>
+            <w:r>
+              <w:rPr>
+                <w:rFonts w:ascii="Consolas" w:hAnsi="Consolas"/>
+                <w:sz w:val="19"/>
+              </w:rPr>
+              <w:t>settings/data-onboarding</w:t>
+            </w:r>
+          </w:p>
+        </w:tc>
+      </w:tr>
+      <w:tr>
+        <w:tc>
+          <w:tcPr>
+            <w:tcW w:type="dxa" w:w="2880"/>
+          </w:tcPr>
+          <w:p>
+            <w:r>
+              <w:t>Customer import</w:t>
+            </w:r>
+          </w:p>
+        </w:tc>
+        <w:tc>
+          <w:tcPr>
+            <w:tcW w:type="dxa" w:w="2880"/>
+          </w:tcPr>
+          <w:p>
+            <w:r>
+              <w:t>✅</w:t>
+            </w:r>
+          </w:p>
+        </w:tc>
+        <w:tc>
+          <w:tcPr>
+            <w:tcW w:type="dxa" w:w="2880"/>
+          </w:tcPr>
+          <w:p>
+            <w:r>
+              <w:t>import system (</w:t>
+            </w:r>
+            <w:r>
+              <w:rPr>
+                <w:rFonts w:ascii="Consolas" w:hAnsi="Consolas"/>
+                <w:sz w:val="19"/>
+              </w:rPr>
+              <w:t>customer.import</w:t>
+            </w:r>
+            <w:r>
+              <w:t>)</w:t>
+            </w:r>
+          </w:p>
+        </w:tc>
+      </w:tr>
+      <w:tr>
+        <w:tc>
+          <w:tcPr>
+            <w:tcW w:type="dxa" w:w="2880"/>
+          </w:tcPr>
+          <w:p>
+            <w:r>
+              <w:t>Product import</w:t>
+            </w:r>
+          </w:p>
+        </w:tc>
+        <w:tc>
+          <w:tcPr>
+            <w:tcW w:type="dxa" w:w="2880"/>
+          </w:tcPr>
+          <w:p>
+            <w:r>
+              <w:t>✅</w:t>
+            </w:r>
+          </w:p>
+        </w:tc>
+        <w:tc>
+          <w:tcPr>
+            <w:tcW w:type="dxa" w:w="2880"/>
+          </w:tcPr>
+          <w:p>
+            <w:r>
+              <w:t>import system (</w:t>
+            </w:r>
+            <w:r>
+              <w:rPr>
+                <w:rFonts w:ascii="Consolas" w:hAnsi="Consolas"/>
+                <w:sz w:val="19"/>
+              </w:rPr>
+              <w:t>product.import</w:t>
+            </w:r>
+            <w:r>
+              <w:t>)</w:t>
+            </w:r>
+          </w:p>
+        </w:tc>
+      </w:tr>
+      <w:tr>
+        <w:tc>
+          <w:tcPr>
+            <w:tcW w:type="dxa" w:w="2880"/>
+          </w:tcPr>
+          <w:p>
+            <w:r>
+              <w:t>Supplier import</w:t>
+            </w:r>
+          </w:p>
+        </w:tc>
+        <w:tc>
+          <w:tcPr>
+            <w:tcW w:type="dxa" w:w="2880"/>
+          </w:tcPr>
+          <w:p>
+            <w:r>
+              <w:t>✅</w:t>
+            </w:r>
+          </w:p>
+        </w:tc>
+        <w:tc>
+          <w:tcPr>
+            <w:tcW w:type="dxa" w:w="2880"/>
+          </w:tcPr>
+          <w:p>
+            <w:r>
+              <w:t xml:space="preserve">import system + </w:t>
+            </w:r>
+            <w:r>
+              <w:rPr>
+                <w:rFonts w:ascii="Consolas" w:hAnsi="Consolas"/>
+                <w:sz w:val="19"/>
+              </w:rPr>
+              <w:t>suppliers</w:t>
+            </w:r>
+            <w:r>
+              <w:t xml:space="preserve">, </w:t>
+            </w:r>
+            <w:r>
+              <w:rPr>
+                <w:rFonts w:ascii="Consolas" w:hAnsi="Consolas"/>
+                <w:sz w:val="19"/>
+              </w:rPr>
+              <w:t>erp_suppliers</w:t>
+            </w:r>
+          </w:p>
+        </w:tc>
+      </w:tr>
+      <w:tr>
+        <w:tc>
+          <w:tcPr>
+            <w:tcW w:type="dxa" w:w="2880"/>
+          </w:tcPr>
+          <w:p>
+            <w:r>
+              <w:t>Opening balance / inventory import</w:t>
+            </w:r>
+          </w:p>
+        </w:tc>
+        <w:tc>
+          <w:tcPr>
+            <w:tcW w:type="dxa" w:w="2880"/>
+          </w:tcPr>
+          <w:p>
+            <w:r>
+              <w:t>◐</w:t>
+            </w:r>
+          </w:p>
+        </w:tc>
+        <w:tc>
+          <w:tcPr>
+            <w:tcW w:type="dxa" w:w="2880"/>
+          </w:tcPr>
+          <w:p>
+            <w:r>
+              <w:rPr>
+                <w:rFonts w:ascii="Consolas" w:hAnsi="Consolas"/>
+                <w:sz w:val="19"/>
+              </w:rPr>
+              <w:t>erp_van_opening_balances</w:t>
+            </w:r>
+            <w:r>
+              <w:t xml:space="preserve"> + import; general opening-stock UI partial</w:t>
+            </w:r>
+          </w:p>
+        </w:tc>
+      </w:tr>
+      <w:tr>
+        <w:tc>
+          <w:tcPr>
+            <w:tcW w:type="dxa" w:w="2880"/>
+          </w:tcPr>
+          <w:p>
+            <w:r>
+              <w:t>User import</w:t>
+            </w:r>
+          </w:p>
+        </w:tc>
+        <w:tc>
+          <w:tcPr>
+            <w:tcW w:type="dxa" w:w="2880"/>
+          </w:tcPr>
+          <w:p>
+            <w:r>
+              <w:t>✅</w:t>
+            </w:r>
+          </w:p>
+        </w:tc>
+        <w:tc>
+          <w:tcPr>
+            <w:tcW w:type="dxa" w:w="2880"/>
+          </w:tcPr>
+          <w:p>
+            <w:r>
+              <w:t>import system (</w:t>
+            </w:r>
+            <w:r>
+              <w:rPr>
+                <w:rFonts w:ascii="Consolas" w:hAnsi="Consolas"/>
+                <w:sz w:val="19"/>
+              </w:rPr>
+              <w:t>user.import</w:t>
+            </w:r>
+            <w:r>
+              <w:t xml:space="preserve">); </w:t>
+            </w:r>
+            <w:r>
+              <w:rPr>
+                <w:rFonts w:ascii="Consolas" w:hAnsi="Consolas"/>
+                <w:sz w:val="19"/>
+              </w:rPr>
+              <w:t>settings/users</w:t>
+            </w:r>
+            <w:r>
+              <w:t xml:space="preserve">, </w:t>
+            </w:r>
+            <w:r>
+              <w:rPr>
+                <w:rFonts w:ascii="Consolas" w:hAnsi="Consolas"/>
+                <w:sz w:val="19"/>
+              </w:rPr>
+              <w:t>settings/staff</w:t>
+            </w:r>
+          </w:p>
+        </w:tc>
+      </w:tr>
+      <w:tr>
+        <w:tc>
+          <w:tcPr>
+            <w:tcW w:type="dxa" w:w="2880"/>
+          </w:tcPr>
+          <w:p>
+            <w:r>
+              <w:t>ERP / integration settings</w:t>
+            </w:r>
+          </w:p>
+        </w:tc>
+        <w:tc>
+          <w:tcPr>
+            <w:tcW w:type="dxa" w:w="2880"/>
+          </w:tcPr>
+          <w:p>
+            <w:r>
+              <w:t>✅</w:t>
+            </w:r>
+          </w:p>
+        </w:tc>
+        <w:tc>
+          <w:tcPr>
+            <w:tcW w:type="dxa" w:w="2880"/>
+          </w:tcPr>
+          <w:p>
+            <w:r>
+              <w:rPr>
+                <w:rFonts w:ascii="Consolas" w:hAnsi="Consolas"/>
+                <w:sz w:val="19"/>
+              </w:rPr>
+              <w:t>erp_integrations/api_keys/webhooks/sync</w:t>
+            </w:r>
+            <w:r>
+              <w:t xml:space="preserve">; </w:t>
+            </w:r>
+            <w:r>
+              <w:rPr>
+                <w:rFonts w:ascii="Consolas" w:hAnsi="Consolas"/>
+                <w:sz w:val="19"/>
+              </w:rPr>
+              <w:t>settings/integrations(/*)</w:t>
+            </w:r>
+            <w:r>
+              <w:t xml:space="preserve">, </w:t>
+            </w:r>
+            <w:r>
+              <w:rPr>
+                <w:rFonts w:ascii="Consolas" w:hAnsi="Consolas"/>
+                <w:sz w:val="19"/>
+              </w:rPr>
+              <w:t>settings/integration-hub</w:t>
+            </w:r>
+          </w:p>
+        </w:tc>
+      </w:tr>
+      <w:tr>
+        <w:tc>
+          <w:tcPr>
+            <w:tcW w:type="dxa" w:w="2880"/>
+          </w:tcPr>
+          <w:p>
+            <w:r>
+              <w:t>Route / territory / journey plan</w:t>
+            </w:r>
+          </w:p>
+        </w:tc>
+        <w:tc>
+          <w:tcPr>
+            <w:tcW w:type="dxa" w:w="2880"/>
+          </w:tcPr>
+          <w:p>
+            <w:r>
+              <w:t>✅</w:t>
+            </w:r>
+          </w:p>
+        </w:tc>
+        <w:tc>
+          <w:tcPr>
+            <w:tcW w:type="dxa" w:w="2880"/>
+          </w:tcPr>
+          <w:p>
+            <w:r>
+              <w:rPr>
+                <w:rFonts w:ascii="Consolas" w:hAnsi="Consolas"/>
+                <w:sz w:val="19"/>
+              </w:rPr>
+              <w:t>erp_routes/route_customers/territories/territory_customers/journey_plans</w:t>
+            </w:r>
+            <w:r>
+              <w:t xml:space="preserve">; </w:t>
+            </w:r>
+            <w:r>
+              <w:rPr>
+                <w:rFonts w:ascii="Consolas" w:hAnsi="Consolas"/>
+                <w:sz w:val="19"/>
+              </w:rPr>
+              <w:t>territory</w:t>
+            </w:r>
+            <w:r>
+              <w:t xml:space="preserve">, </w:t>
+            </w:r>
+            <w:r>
+              <w:rPr>
+                <w:rFonts w:ascii="Consolas" w:hAnsi="Consolas"/>
+                <w:sz w:val="19"/>
+              </w:rPr>
+              <w:t>distribution/routes</w:t>
+            </w:r>
+            <w:r>
+              <w:t xml:space="preserve">, </w:t>
+            </w:r>
+            <w:r>
+              <w:rPr>
+                <w:rFonts w:ascii="Consolas" w:hAnsi="Consolas"/>
+                <w:sz w:val="19"/>
+              </w:rPr>
+              <w:t>field/journey</w:t>
+            </w:r>
+            <w:r>
+              <w:t xml:space="preserve">, </w:t>
+            </w:r>
+            <w:r>
+              <w:rPr>
+                <w:rFonts w:ascii="Consolas" w:hAnsi="Consolas"/>
+                <w:sz w:val="19"/>
+              </w:rPr>
+              <w:t>sales/journey</w:t>
+            </w:r>
+          </w:p>
+        </w:tc>
+      </w:tr>
+      <w:tr>
+        <w:tc>
+          <w:tcPr>
+            <w:tcW w:type="dxa" w:w="2880"/>
+          </w:tcPr>
+          <w:p>
+            <w:r>
+              <w:t>Approval workflows / change requests</w:t>
+            </w:r>
+          </w:p>
+        </w:tc>
+        <w:tc>
+          <w:tcPr>
+            <w:tcW w:type="dxa" w:w="2880"/>
+          </w:tcPr>
+          <w:p>
+            <w:r>
+              <w:t>✅</w:t>
+            </w:r>
+          </w:p>
+        </w:tc>
+        <w:tc>
+          <w:tcPr>
+            <w:tcW w:type="dxa" w:w="2880"/>
+          </w:tcPr>
+          <w:p>
+            <w:r>
+              <w:rPr>
+                <w:rFonts w:ascii="Consolas" w:hAnsi="Consolas"/>
+                <w:sz w:val="19"/>
+              </w:rPr>
+              <w:t>erp_workflow_*</w:t>
+            </w:r>
+            <w:r>
+              <w:t xml:space="preserve">, </w:t>
+            </w:r>
+            <w:r>
+              <w:rPr>
+                <w:rFonts w:ascii="Consolas" w:hAnsi="Consolas"/>
+                <w:sz w:val="19"/>
+              </w:rPr>
+              <w:t>erp_change_requests(+entities/targets/values)</w:t>
+            </w:r>
+            <w:r>
+              <w:t xml:space="preserve">; </w:t>
+            </w:r>
+            <w:r>
+              <w:rPr>
+                <w:rFonts w:ascii="Consolas" w:hAnsi="Consolas"/>
+                <w:sz w:val="19"/>
+              </w:rPr>
+              <w:t>settings/workflows</w:t>
+            </w:r>
+            <w:r>
+              <w:t xml:space="preserve">, </w:t>
+            </w:r>
+            <w:r>
+              <w:rPr>
+                <w:rFonts w:ascii="Consolas" w:hAnsi="Consolas"/>
+                <w:sz w:val="19"/>
+              </w:rPr>
+              <w:t>approvals/queue</w:t>
+            </w:r>
+            <w:r>
+              <w:t xml:space="preserve">, </w:t>
+            </w:r>
+            <w:r>
+              <w:rPr>
+                <w:rFonts w:ascii="Consolas" w:hAnsi="Consolas"/>
+                <w:sz w:val="19"/>
+              </w:rPr>
+              <w:t>approval-center</w:t>
+            </w:r>
+          </w:p>
+        </w:tc>
+      </w:tr>
+      <w:tr>
+        <w:tc>
+          <w:tcPr>
+            <w:tcW w:type="dxa" w:w="2880"/>
+          </w:tcPr>
+          <w:p>
+            <w:r>
+              <w:t>Credit limit / payment terms approval</w:t>
+            </w:r>
+          </w:p>
+        </w:tc>
+        <w:tc>
+          <w:tcPr>
+            <w:tcW w:type="dxa" w:w="2880"/>
+          </w:tcPr>
+          <w:p>
+            <w:r>
+              <w:t>✅</w:t>
+            </w:r>
+          </w:p>
+        </w:tc>
+        <w:tc>
+          <w:tcPr>
+            <w:tcW w:type="dxa" w:w="2880"/>
+          </w:tcPr>
+          <w:p>
+            <w:r>
+              <w:rPr>
+                <w:rFonts w:ascii="Consolas" w:hAnsi="Consolas"/>
+                <w:sz w:val="19"/>
+              </w:rPr>
+              <w:t>erp_credit_limit_requests</w:t>
+            </w:r>
+            <w:r>
+              <w:t xml:space="preserve">, customer requests; </w:t>
+            </w:r>
+            <w:r>
+              <w:rPr>
+                <w:rFonts w:ascii="Consolas" w:hAnsi="Consolas"/>
+                <w:sz w:val="19"/>
+              </w:rPr>
+              <w:t>distribution/credit-requests</w:t>
+            </w:r>
+          </w:p>
+        </w:tc>
+      </w:tr>
+      <w:tr>
+        <w:tc>
+          <w:tcPr>
+            <w:tcW w:type="dxa" w:w="2880"/>
+          </w:tcPr>
+          <w:p>
+            <w:r>
+              <w:t>Customer closure / reactivation approval</w:t>
+            </w:r>
+          </w:p>
+        </w:tc>
+        <w:tc>
+          <w:tcPr>
+            <w:tcW w:type="dxa" w:w="2880"/>
+          </w:tcPr>
+          <w:p>
+            <w:r>
+              <w:t>✅</w:t>
+            </w:r>
+          </w:p>
+        </w:tc>
+        <w:tc>
+          <w:tcPr>
+            <w:tcW w:type="dxa" w:w="2880"/>
+          </w:tcPr>
+          <w:p>
+            <w:r>
+              <w:t>customer requests (close/reactivate) + the P-series rules (just shipped)</w:t>
+            </w:r>
+          </w:p>
+        </w:tc>
+      </w:tr>
+      <w:tr>
+        <w:tc>
+          <w:tcPr>
+            <w:tcW w:type="dxa" w:w="2880"/>
+          </w:tcPr>
+          <w:p>
+            <w:r>
+              <w:t>Document numbering / invoice sequence</w:t>
+            </w:r>
+          </w:p>
+        </w:tc>
+        <w:tc>
+          <w:tcPr>
+            <w:tcW w:type="dxa" w:w="2880"/>
+          </w:tcPr>
+          <w:p>
+            <w:r>
+              <w:t>◐</w:t>
+            </w:r>
+          </w:p>
+        </w:tc>
+        <w:tc>
+          <w:tcPr>
+            <w:tcW w:type="dxa" w:w="2880"/>
+          </w:tcPr>
+          <w:p>
+            <w:r>
+              <w:rPr>
+                <w:rFonts w:ascii="Consolas" w:hAnsi="Consolas"/>
+                <w:sz w:val="19"/>
+              </w:rPr>
+              <w:t>erp_sequences</w:t>
+            </w:r>
+            <w:r>
+              <w:t xml:space="preserve"> (auto-numbering works); </w:t>
+            </w:r>
+            <w:r>
+              <w:rPr>
+                <w:b/>
+              </w:rPr>
+              <w:t>admin-configurable numbering UI missing</w:t>
+            </w:r>
+          </w:p>
+        </w:tc>
+      </w:tr>
+      <w:tr>
+        <w:tc>
+          <w:tcPr>
+            <w:tcW w:type="dxa" w:w="2880"/>
+          </w:tcPr>
+          <w:p>
+            <w:r>
+              <w:t>Tax / VAT / currency</w:t>
+            </w:r>
+          </w:p>
+        </w:tc>
+        <w:tc>
+          <w:tcPr>
+            <w:tcW w:type="dxa" w:w="2880"/>
+          </w:tcPr>
+          <w:p>
+            <w:r>
+              <w:t>✅ engine / ◐ settings UI</w:t>
+            </w:r>
+          </w:p>
+        </w:tc>
+        <w:tc>
+          <w:tcPr>
+            <w:tcW w:type="dxa" w:w="2880"/>
+          </w:tcPr>
+          <w:p>
+            <w:r>
+              <w:rPr>
+                <w:rFonts w:ascii="Consolas" w:hAnsi="Consolas"/>
+                <w:sz w:val="19"/>
+              </w:rPr>
+              <w:t>erp_country_vat/tax_determination_rules/tax_registrations/tax_ledger</w:t>
+            </w:r>
+            <w:r>
+              <w:t xml:space="preserve">, </w:t>
+            </w:r>
+            <w:r>
+              <w:rPr>
+                <w:rFonts w:ascii="Consolas" w:hAnsi="Consolas"/>
+                <w:sz w:val="19"/>
+              </w:rPr>
+              <w:t>lib/tax/*</w:t>
+            </w:r>
+            <w:r>
+              <w:t xml:space="preserve">, </w:t>
+            </w:r>
+            <w:r>
+              <w:rPr>
+                <w:rFonts w:ascii="Consolas" w:hAnsi="Consolas"/>
+                <w:sz w:val="19"/>
+              </w:rPr>
+              <w:t>settings/einvoice</w:t>
+            </w:r>
+            <w:r>
+              <w:t xml:space="preserve">; company tax/currency </w:t>
+            </w:r>
+            <w:r>
+              <w:rPr>
+                <w:b/>
+              </w:rPr>
+              <w:t>onboarding settings UI</w:t>
+            </w:r>
+            <w:r>
+              <w:t xml:space="preserve"> partial</w:t>
+            </w:r>
+          </w:p>
+        </w:tc>
+      </w:tr>
+      <w:tr>
+        <w:tc>
+          <w:tcPr>
+            <w:tcW w:type="dxa" w:w="2880"/>
+          </w:tcPr>
+          <w:p>
+            <w:r>
+              <w:t>Dashboard / module selection</w:t>
+            </w:r>
+          </w:p>
+        </w:tc>
+        <w:tc>
+          <w:tcPr>
+            <w:tcW w:type="dxa" w:w="2880"/>
+          </w:tcPr>
+          <w:p>
+            <w:r>
+              <w:t>✅</w:t>
+            </w:r>
+          </w:p>
+        </w:tc>
+        <w:tc>
+          <w:tcPr>
+            <w:tcW w:type="dxa" w:w="2880"/>
+          </w:tcPr>
+          <w:p>
+            <w:r>
+              <w:rPr>
+                <w:rFonts w:ascii="Consolas" w:hAnsi="Consolas"/>
+                <w:sz w:val="19"/>
+              </w:rPr>
+              <w:t>erp_modules/company_modules/business_type_modules</w:t>
+            </w:r>
+            <w:r>
+              <w:t xml:space="preserve">; </w:t>
+            </w:r>
+            <w:r>
+              <w:rPr>
+                <w:rFonts w:ascii="Consolas" w:hAnsi="Consolas"/>
+                <w:sz w:val="19"/>
+              </w:rPr>
+              <w:t>settings/features</w:t>
+            </w:r>
+            <w:r>
+              <w:t>, setup-wizard toggles</w:t>
+            </w:r>
+          </w:p>
+        </w:tc>
+      </w:tr>
+      <w:tr>
+        <w:tc>
+          <w:tcPr>
+            <w:tcW w:type="dxa" w:w="2880"/>
+          </w:tcPr>
+          <w:p>
+            <w:r>
+              <w:t>Workflow / operating templates (Cash Van, Pre-Sales, Hybrid, Retail, Pharmacy)</w:t>
+            </w:r>
+          </w:p>
+        </w:tc>
+        <w:tc>
+          <w:tcPr>
+            <w:tcW w:type="dxa" w:w="2880"/>
+          </w:tcPr>
+          <w:p>
+            <w:r>
+              <w:t>✅ engine / ◐ operating-mode selector</w:t>
+            </w:r>
+          </w:p>
+        </w:tc>
+        <w:tc>
+          <w:tcPr>
+            <w:tcW w:type="dxa" w:w="2880"/>
+          </w:tcPr>
+          <w:p>
+            <w:r>
+              <w:rPr>
+                <w:rFonts w:ascii="Consolas" w:hAnsi="Consolas"/>
+                <w:sz w:val="19"/>
+              </w:rPr>
+              <w:t>erp_workflow_templates</w:t>
+            </w:r>
+            <w:r>
+              <w:t xml:space="preserve">, </w:t>
+            </w:r>
+            <w:r>
+              <w:rPr>
+                <w:rFonts w:ascii="Consolas" w:hAnsi="Consolas"/>
+                <w:sz w:val="19"/>
+              </w:rPr>
+              <w:t>workflow-builder/templates.ts</w:t>
+            </w:r>
+            <w:r>
+              <w:t xml:space="preserve">, </w:t>
+            </w:r>
+            <w:r>
+              <w:rPr>
+                <w:rFonts w:ascii="Consolas" w:hAnsi="Consolas"/>
+                <w:sz w:val="19"/>
+              </w:rPr>
+              <w:t>settings/workflows/templates</w:t>
+            </w:r>
+            <w:r>
+              <w:t xml:space="preserve">, van-sales; explicit </w:t>
+            </w:r>
+            <w:r>
+              <w:rPr>
+                <w:b/>
+              </w:rPr>
+              <w:t>operating-model picker</w:t>
+            </w:r>
+            <w:r>
+              <w:t xml:space="preserve"> partial</w:t>
+            </w:r>
+          </w:p>
+        </w:tc>
+      </w:tr>
+      <w:tr>
+        <w:tc>
+          <w:tcPr>
+            <w:tcW w:type="dxa" w:w="2880"/>
+          </w:tcPr>
+          <w:p>
+            <w:r>
+              <w:t>Multi-UoM</w:t>
+            </w:r>
+          </w:p>
+        </w:tc>
+        <w:tc>
+          <w:tcPr>
+            <w:tcW w:type="dxa" w:w="2880"/>
+          </w:tcPr>
+          <w:p>
+            <w:r>
+              <w:t>✅</w:t>
+            </w:r>
+          </w:p>
+        </w:tc>
+        <w:tc>
+          <w:tcPr>
+            <w:tcW w:type="dxa" w:w="2880"/>
+          </w:tcPr>
+          <w:p>
+            <w:r>
+              <w:rPr>
+                <w:rFonts w:ascii="Consolas" w:hAnsi="Consolas"/>
+                <w:sz w:val="19"/>
+              </w:rPr>
+              <w:t>erp_product_uoms</w:t>
+            </w:r>
+            <w:r>
+              <w:t xml:space="preserve">, </w:t>
+            </w:r>
+            <w:r>
+              <w:rPr>
+                <w:rFonts w:ascii="Consolas" w:hAnsi="Consolas"/>
+                <w:sz w:val="19"/>
+              </w:rPr>
+              <w:t>settings/uom</w:t>
+            </w:r>
+          </w:p>
+        </w:tc>
+      </w:tr>
+      <w:tr>
+        <w:tc>
+          <w:tcPr>
+            <w:tcW w:type="dxa" w:w="2880"/>
+          </w:tcPr>
+          <w:p>
+            <w:r>
+              <w:t>Role templates &amp; permission overrides</w:t>
+            </w:r>
+          </w:p>
+        </w:tc>
+        <w:tc>
+          <w:tcPr>
+            <w:tcW w:type="dxa" w:w="2880"/>
+          </w:tcPr>
+          <w:p>
+            <w:r>
+              <w:t>✅</w:t>
+            </w:r>
+          </w:p>
+        </w:tc>
+        <w:tc>
+          <w:tcPr>
+            <w:tcW w:type="dxa" w:w="2880"/>
+          </w:tcPr>
+          <w:p>
+            <w:r>
+              <w:rPr>
+                <w:rFonts w:ascii="Consolas" w:hAnsi="Consolas"/>
+                <w:sz w:val="19"/>
+              </w:rPr>
+              <w:t>erp_role_template_versions</w:t>
+            </w:r>
+            <w:r>
+              <w:t xml:space="preserve">, </w:t>
+            </w:r>
+            <w:r>
+              <w:rPr>
+                <w:rFonts w:ascii="Consolas" w:hAnsi="Consolas"/>
+                <w:sz w:val="19"/>
+              </w:rPr>
+              <w:t>erp_company_role_permissions</w:t>
+            </w:r>
+            <w:r>
+              <w:t xml:space="preserve">, </w:t>
+            </w:r>
+            <w:r>
+              <w:rPr>
+                <w:rFonts w:ascii="Consolas" w:hAnsi="Consolas"/>
+                <w:sz w:val="19"/>
+              </w:rPr>
+              <w:t>settings/permissions</w:t>
+            </w:r>
+            <w:r>
+              <w:t>, setup-wizard role seeding</w:t>
+            </w:r>
+          </w:p>
+        </w:tc>
+      </w:tr>
+      <w:tr>
+        <w:tc>
+          <w:tcPr>
+            <w:tcW w:type="dxa" w:w="2880"/>
+          </w:tcPr>
+          <w:p>
+            <w:r>
+              <w:t>Industry templates</w:t>
+            </w:r>
+          </w:p>
+        </w:tc>
+        <w:tc>
+          <w:tcPr>
+            <w:tcW w:type="dxa" w:w="2880"/>
+          </w:tcPr>
+          <w:p>
+            <w:r>
+              <w:t>✅ engine / ◐ gallery</w:t>
+            </w:r>
+          </w:p>
+        </w:tc>
+        <w:tc>
+          <w:tcPr>
+            <w:tcW w:type="dxa" w:w="2880"/>
+          </w:tcPr>
+          <w:p>
+            <w:r>
+              <w:rPr>
+                <w:rFonts w:ascii="Consolas" w:hAnsi="Consolas"/>
+                <w:sz w:val="19"/>
+              </w:rPr>
+              <w:t>setup-wizard.ts</w:t>
+            </w:r>
+            <w:r>
+              <w:t xml:space="preserve"> SetupProfiles per </w:t>
+            </w:r>
+            <w:r>
+              <w:rPr>
+                <w:rFonts w:ascii="Consolas" w:hAnsi="Consolas"/>
+                <w:sz w:val="19"/>
+              </w:rPr>
+              <w:t>business_type</w:t>
+            </w:r>
+            <w:r>
+              <w:t xml:space="preserve">, </w:t>
+            </w:r>
+            <w:r>
+              <w:rPr>
+                <w:rFonts w:ascii="Consolas" w:hAnsi="Consolas"/>
+                <w:sz w:val="19"/>
+              </w:rPr>
+              <w:t>erp_business_type_modules</w:t>
+            </w:r>
+            <w:r>
+              <w:t xml:space="preserve">, </w:t>
+            </w:r>
+            <w:r>
+              <w:rPr>
+                <w:rFonts w:ascii="Consolas" w:hAnsi="Consolas"/>
+                <w:sz w:val="19"/>
+              </w:rPr>
+              <w:t>pharmacy/onboarding</w:t>
+            </w:r>
+          </w:p>
+        </w:tc>
+      </w:tr>
+    </w:tbl>
+    <w:p/>
+    <w:p>
+      <w:r>
+        <w:rPr>
+          <w:b/>
+        </w:rPr>
+        <w:t>Net:</w:t>
+      </w:r>
+      <w:r>
+        <w:t xml:space="preserve"> ~14 ✅, ~4 ◐, </w:t>
+      </w:r>
+      <w:r>
+        <w:rPr>
+          <w:b/>
+        </w:rPr>
+        <w:t>0 ✗</w:t>
+      </w:r>
+      <w:r>
+        <w:t xml:space="preserve">. The onboarding mostly </w:t>
+      </w:r>
+      <w:r>
+        <w:rPr>
+          <w:b/>
+        </w:rPr>
+        <w:t>wires/exposes</w:t>
+      </w:r>
+      <w:r>
+        <w:t xml:space="preserve"> what exists.</w:t>
+      </w:r>
+    </w:p>
+    <w:p>
+      <w:pPr>
+        <w:pStyle w:val="Heading2"/>
+      </w:pPr>
+      <w:r>
+        <w:rPr>
+          <w:color w:val="1F497D"/>
+        </w:rPr>
+        <w:t>3. Updated wizard structure (Core + Advanced; business-friendly)</w:t>
+      </w:r>
+    </w:p>
+    <w:p>
+      <w:r>
+        <w:t xml:space="preserve">Keep the core flow short; group power-user areas under </w:t>
+      </w:r>
+      <w:r>
+        <w:rPr>
+          <w:b/>
+        </w:rPr>
+        <w:t>Advanced Setup</w:t>
+      </w:r>
+      <w:r>
+        <w:t xml:space="preserve"> (collapsible,</w:t>
+      </w:r>
+    </w:p>
+    <w:p>
+      <w:r>
+        <w:t>optional, skippable — flagged in Go-Live, not lost).</w:t>
+      </w:r>
+    </w:p>
+    <w:p>
+      <w:pPr>
+        <w:ind w:left="240"/>
+      </w:pPr>
+      <w:r>
+        <w:rPr>
+          <w:rFonts w:ascii="Consolas" w:hAnsi="Consolas"/>
+          <w:sz w:val="18"/>
+        </w:rPr>
+        <w:t>CORE (most companies)                         ADVANCED SETUP (optional / skippable)</w:t>
+        <w:br/>
+        <w:t>1  Company Basics                ✅            7  Approval Matrix            ✅ (workflows/templates)</w:t>
+        <w:br/>
+        <w:t>2  Industry / Operating Template ✅◐ setup-wizard 12 Financial Settings (Tax/VAT/Currency) ✅◐</w:t>
+        <w:br/>
+        <w:t>3  Modules &amp; Workflow Template   ✅            13 Document Numbering         ◐</w:t>
+        <w:br/>
+        <w:t>4  Organization Structure        ✎ builder    14 Integrations              ✅</w:t>
+        <w:br/>
+        <w:t>5  Reporting Hierarchy           ✅ (reports_to)</w:t>
+        <w:br/>
+        <w:t>6  Roles &amp; Permissions           ✅            (Advanced steps are reachable from a single</w:t>
+        <w:br/>
+        <w:t>8  Product Hierarchy             ✅◐            "Advanced Setup" card on the Review screen,</w:t>
+        <w:br/>
+        <w:t>9  Multi-UoM                     ✅            so the Core path stays ~9 steps.)</w:t>
+        <w:br/>
+        <w:t>10 Data Import                   ✅</w:t>
+        <w:br/>
+        <w:t>11 Territory / Routes / Journey  ✅</w:t>
+        <w:br/>
+        <w:t>15 Users                         ✅</w:t>
+        <w:br/>
+        <w:t>16 Dashboards                    ✅</w:t>
+        <w:br/>
+        <w:t>17 Review / Sandbox / Go-Live    ✅◐ (sandbox = future)</w:t>
+      </w:r>
+    </w:p>
+    <w:p>
+      <w:r>
+        <w:t xml:space="preserve">Each step </w:t>
+      </w:r>
+      <w:r>
+        <w:rPr>
+          <w:b/>
+        </w:rPr>
+        <w:t>embeds or deep-links the existing screen</w:t>
+      </w:r>
+      <w:r>
+        <w:t xml:space="preserve"> in wizard chrome (progress rail +</w:t>
+      </w:r>
+    </w:p>
+    <w:p>
+      <w:r>
+        <w:t>Back/Next), so onboarding reuses the real engines and the same screens remain available</w:t>
+      </w:r>
+    </w:p>
+    <w:p>
+      <w:r>
+        <w:t>later under Settings.</w:t>
+      </w:r>
+    </w:p>
+    <w:p>
+      <w:pPr>
+        <w:pStyle w:val="Heading2"/>
+      </w:pPr>
+      <w:r>
+        <w:rPr>
+          <w:color w:val="1F497D"/>
+        </w:rPr>
+        <w:t>4. Existing Platform Reuse Map</w:t>
+      </w:r>
+    </w:p>
+    <w:tbl>
+      <w:tblPr>
+        <w:tblStyle w:val="LightGrid-Accent1"/>
+        <w:tblW w:type="auto" w:w="0"/>
+        <w:jc w:val="center"/>
+        <w:tblLook w:firstColumn="1" w:firstRow="1" w:lastColumn="0" w:lastRow="0" w:noHBand="0" w:noVBand="1" w:val="04A0"/>
+      </w:tblPr>
+      <w:tblGrid>
+        <w:gridCol w:w="1728"/>
+        <w:gridCol w:w="1728"/>
+        <w:gridCol w:w="1728"/>
+        <w:gridCol w:w="1728"/>
+        <w:gridCol w:w="1728"/>
+      </w:tblGrid>
+      <w:tr>
+        <w:tc>
+          <w:tcPr>
+            <w:tcW w:type="dxa" w:w="1728"/>
+            <w:shd w:val="clear" w:fill="1F497D"/>
+          </w:tcPr>
+          <w:p>
+            <w:r>
+              <w:rPr>
+                <w:b/>
+                <w:color w:val="FFFFFF"/>
+              </w:rPr>
+              <w:t>Existing capability</w:t>
+            </w:r>
+          </w:p>
+        </w:tc>
+        <w:tc>
+          <w:tcPr>
+            <w:tcW w:type="dxa" w:w="1728"/>
+            <w:shd w:val="clear" w:fill="1F497D"/>
+          </w:tcPr>
+          <w:p>
+            <w:r>
+              <w:rPr>
+                <w:b/>
+                <w:color w:val="FFFFFF"/>
+              </w:rPr>
+              <w:t>Current location / module</w:t>
+            </w:r>
+          </w:p>
+        </w:tc>
+        <w:tc>
+          <w:tcPr>
+            <w:tcW w:type="dxa" w:w="1728"/>
+            <w:shd w:val="clear" w:fill="1F497D"/>
+          </w:tcPr>
+          <w:p>
+            <w:r>
+              <w:rPr>
+                <w:b/>
+                <w:color w:val="FFFFFF"/>
+              </w:rPr>
+              <w:t>How it appears in onboarding</w:t>
+            </w:r>
+          </w:p>
+        </w:tc>
+        <w:tc>
+          <w:tcPr>
+            <w:tcW w:type="dxa" w:w="1728"/>
+            <w:shd w:val="clear" w:fill="1F497D"/>
+          </w:tcPr>
+          <w:p>
+            <w:r>
+              <w:rPr>
+                <w:b/>
+                <w:color w:val="FFFFFF"/>
+              </w:rPr>
+              <w:t>Req/Opt</w:t>
+            </w:r>
+          </w:p>
+        </w:tc>
+        <w:tc>
+          <w:tcPr>
+            <w:tcW w:type="dxa" w:w="1728"/>
+            <w:shd w:val="clear" w:fill="1F497D"/>
+          </w:tcPr>
+          <w:p>
+            <w:r>
+              <w:rPr>
+                <w:b/>
+                <w:color w:val="FFFFFF"/>
+              </w:rPr>
+              <w:t>Gap / missing UI</w:t>
+            </w:r>
+          </w:p>
+        </w:tc>
+      </w:tr>
+      <w:tr>
+        <w:tc>
+          <w:tcPr>
+            <w:tcW w:type="dxa" w:w="1728"/>
+          </w:tcPr>
+          <w:p>
+            <w:r>
+              <w:t>Smart Setup Wizard (business profiles, modules, role seed)</w:t>
+            </w:r>
+          </w:p>
+        </w:tc>
+        <w:tc>
+          <w:tcPr>
+            <w:tcW w:type="dxa" w:w="1728"/>
+          </w:tcPr>
+          <w:p>
+            <w:r>
+              <w:rPr>
+                <w:rFonts w:ascii="Consolas" w:hAnsi="Consolas"/>
+                <w:sz w:val="19"/>
+              </w:rPr>
+              <w:t>lib/erp/setup-wizard.ts</w:t>
+            </w:r>
+            <w:r>
+              <w:t xml:space="preserve"> + platform/companies</w:t>
+            </w:r>
+          </w:p>
+        </w:tc>
+        <w:tc>
+          <w:tcPr>
+            <w:tcW w:type="dxa" w:w="1728"/>
+          </w:tcPr>
+          <w:p>
+            <w:r>
+              <w:rPr>
+                <w:b/>
+              </w:rPr>
+              <w:t>Steps 2–3 &amp; 6 reuse it</w:t>
+            </w:r>
+            <w:r>
+              <w:t xml:space="preserve"> (industry, modules, suggested roles)</w:t>
+            </w:r>
+          </w:p>
+        </w:tc>
+        <w:tc>
+          <w:tcPr>
+            <w:tcW w:type="dxa" w:w="1728"/>
+          </w:tcPr>
+          <w:p>
+            <w:r>
+              <w:t>Req</w:t>
+            </w:r>
+          </w:p>
+        </w:tc>
+        <w:tc>
+          <w:tcPr>
+            <w:tcW w:type="dxa" w:w="1728"/>
+          </w:tcPr>
+          <w:p>
+            <w:r>
+              <w:t>wrap in wizard chrome; richer gallery</w:t>
+            </w:r>
+          </w:p>
+        </w:tc>
+      </w:tr>
+      <w:tr>
+        <w:tc>
+          <w:tcPr>
+            <w:tcW w:type="dxa" w:w="1728"/>
+          </w:tcPr>
+          <w:p>
+            <w:r>
+              <w:t>Module/feature selection</w:t>
+            </w:r>
+          </w:p>
+        </w:tc>
+        <w:tc>
+          <w:tcPr>
+            <w:tcW w:type="dxa" w:w="1728"/>
+          </w:tcPr>
+          <w:p>
+            <w:r>
+              <w:rPr>
+                <w:rFonts w:ascii="Consolas" w:hAnsi="Consolas"/>
+                <w:sz w:val="19"/>
+              </w:rPr>
+              <w:t>settings/features</w:t>
+            </w:r>
+            <w:r>
+              <w:t xml:space="preserve">, </w:t>
+            </w:r>
+            <w:r>
+              <w:rPr>
+                <w:rFonts w:ascii="Consolas" w:hAnsi="Consolas"/>
+                <w:sz w:val="19"/>
+              </w:rPr>
+              <w:t>erp_company_modules</w:t>
+            </w:r>
+          </w:p>
+        </w:tc>
+        <w:tc>
+          <w:tcPr>
+            <w:tcW w:type="dxa" w:w="1728"/>
+          </w:tcPr>
+          <w:p>
+            <w:r>
+              <w:t>Step 3 (Modules)</w:t>
+            </w:r>
+          </w:p>
+        </w:tc>
+        <w:tc>
+          <w:tcPr>
+            <w:tcW w:type="dxa" w:w="1728"/>
+          </w:tcPr>
+          <w:p>
+            <w:r>
+              <w:t>Req</w:t>
+            </w:r>
+          </w:p>
+        </w:tc>
+        <w:tc>
+          <w:tcPr>
+            <w:tcW w:type="dxa" w:w="1728"/>
+          </w:tcPr>
+          <w:p>
+            <w:r>
+              <w:t>—</w:t>
+            </w:r>
+          </w:p>
+        </w:tc>
+      </w:tr>
+      <w:tr>
+        <w:tc>
+          <w:tcPr>
+            <w:tcW w:type="dxa" w:w="1728"/>
+          </w:tcPr>
+          <w:p>
+            <w:r>
+              <w:t>Workflow templates</w:t>
+            </w:r>
+          </w:p>
+        </w:tc>
+        <w:tc>
+          <w:tcPr>
+            <w:tcW w:type="dxa" w:w="1728"/>
+          </w:tcPr>
+          <w:p>
+            <w:r>
+              <w:rPr>
+                <w:rFonts w:ascii="Consolas" w:hAnsi="Consolas"/>
+                <w:sz w:val="19"/>
+              </w:rPr>
+              <w:t>settings/workflows/templates</w:t>
+            </w:r>
+          </w:p>
+        </w:tc>
+        <w:tc>
+          <w:tcPr>
+            <w:tcW w:type="dxa" w:w="1728"/>
+          </w:tcPr>
+          <w:p>
+            <w:r>
+              <w:t>Step 3/7 (operating + approval templates)</w:t>
+            </w:r>
+          </w:p>
+        </w:tc>
+        <w:tc>
+          <w:tcPr>
+            <w:tcW w:type="dxa" w:w="1728"/>
+          </w:tcPr>
+          <w:p>
+            <w:r>
+              <w:t>Req(core)/Opt(advanced)</w:t>
+            </w:r>
+          </w:p>
+        </w:tc>
+        <w:tc>
+          <w:tcPr>
+            <w:tcW w:type="dxa" w:w="1728"/>
+          </w:tcPr>
+          <w:p>
+            <w:r>
+              <w:t>operating-mode (Cash Van/Pre-Sales/Hybrid) labels</w:t>
+            </w:r>
+          </w:p>
+        </w:tc>
+      </w:tr>
+      <w:tr>
+        <w:tc>
+          <w:tcPr>
+            <w:tcW w:type="dxa" w:w="1728"/>
+          </w:tcPr>
+          <w:p>
+            <w:r>
+              <w:t>Org / regions / branches</w:t>
+            </w:r>
+          </w:p>
+        </w:tc>
+        <w:tc>
+          <w:tcPr>
+            <w:tcW w:type="dxa" w:w="1728"/>
+          </w:tcPr>
+          <w:p>
+            <w:r>
+              <w:rPr>
+                <w:rFonts w:ascii="Consolas" w:hAnsi="Consolas"/>
+                <w:sz w:val="19"/>
+              </w:rPr>
+              <w:t>settings/organization</w:t>
+            </w:r>
+            <w:r>
+              <w:t xml:space="preserve">, </w:t>
+            </w:r>
+            <w:r>
+              <w:rPr>
+                <w:rFonts w:ascii="Consolas" w:hAnsi="Consolas"/>
+                <w:sz w:val="19"/>
+              </w:rPr>
+              <w:t>regions</w:t>
+            </w:r>
+            <w:r>
+              <w:t xml:space="preserve">, </w:t>
+            </w:r>
+            <w:r>
+              <w:rPr>
+                <w:rFonts w:ascii="Consolas" w:hAnsi="Consolas"/>
+                <w:sz w:val="19"/>
+              </w:rPr>
+              <w:t>branches</w:t>
+            </w:r>
+          </w:p>
+        </w:tc>
+        <w:tc>
+          <w:tcPr>
+            <w:tcW w:type="dxa" w:w="1728"/>
+          </w:tcPr>
+          <w:p>
+            <w:r>
+              <w:t>Step 4 (visual builder)</w:t>
+            </w:r>
+          </w:p>
+        </w:tc>
+        <w:tc>
+          <w:tcPr>
+            <w:tcW w:type="dxa" w:w="1728"/>
+          </w:tcPr>
+          <w:p>
+            <w:r>
+              <w:t>Req</w:t>
+            </w:r>
+          </w:p>
+        </w:tc>
+        <w:tc>
+          <w:tcPr>
+            <w:tcW w:type="dxa" w:w="1728"/>
+          </w:tcPr>
+          <w:p>
+            <w:r>
+              <w:rPr>
+                <w:b/>
+              </w:rPr>
+              <w:t>drag-drop org-chart UI (new)</w:t>
+            </w:r>
+          </w:p>
+        </w:tc>
+      </w:tr>
+      <w:tr>
+        <w:tc>
+          <w:tcPr>
+            <w:tcW w:type="dxa" w:w="1728"/>
+          </w:tcPr>
+          <w:p>
+            <w:r>
+              <w:t>Reporting (</w:t>
+            </w:r>
+            <w:r>
+              <w:rPr>
+                <w:rFonts w:ascii="Consolas" w:hAnsi="Consolas"/>
+                <w:sz w:val="19"/>
+              </w:rPr>
+              <w:t>reports_to</w:t>
+            </w:r>
+            <w:r>
+              <w:t>)</w:t>
+            </w:r>
+          </w:p>
+        </w:tc>
+        <w:tc>
+          <w:tcPr>
+            <w:tcW w:type="dxa" w:w="1728"/>
+          </w:tcPr>
+          <w:p>
+            <w:r>
+              <w:rPr>
+                <w:rFonts w:ascii="Consolas" w:hAnsi="Consolas"/>
+                <w:sz w:val="19"/>
+              </w:rPr>
+              <w:t>settings/users</w:t>
+            </w:r>
+            <w:r>
+              <w:t xml:space="preserve">, frozen </w:t>
+            </w:r>
+            <w:r>
+              <w:rPr>
+                <w:rFonts w:ascii="Consolas" w:hAnsi="Consolas"/>
+                <w:sz w:val="19"/>
+              </w:rPr>
+              <w:t>erp_user_subtree</w:t>
+            </w:r>
+          </w:p>
+        </w:tc>
+        <w:tc>
+          <w:tcPr>
+            <w:tcW w:type="dxa" w:w="1728"/>
+          </w:tcPr>
+          <w:p>
+            <w:r>
+              <w:t>Step 5 (visual reporting)</w:t>
+            </w:r>
+          </w:p>
+        </w:tc>
+        <w:tc>
+          <w:tcPr>
+            <w:tcW w:type="dxa" w:w="1728"/>
+          </w:tcPr>
+          <w:p>
+            <w:r>
+              <w:t>Req</w:t>
+            </w:r>
+          </w:p>
+        </w:tc>
+        <w:tc>
+          <w:tcPr>
+            <w:tcW w:type="dxa" w:w="1728"/>
+          </w:tcPr>
+          <w:p>
+            <w:r>
+              <w:t>visual tree on top of existing data</w:t>
+            </w:r>
+          </w:p>
+        </w:tc>
+      </w:tr>
+      <w:tr>
+        <w:tc>
+          <w:tcPr>
+            <w:tcW w:type="dxa" w:w="1728"/>
+          </w:tcPr>
+          <w:p>
+            <w:r>
+              <w:t>Roles &amp; permissions</w:t>
+            </w:r>
+          </w:p>
+        </w:tc>
+        <w:tc>
+          <w:tcPr>
+            <w:tcW w:type="dxa" w:w="1728"/>
+          </w:tcPr>
+          <w:p>
+            <w:r>
+              <w:rPr>
+                <w:rFonts w:ascii="Consolas" w:hAnsi="Consolas"/>
+                <w:sz w:val="19"/>
+              </w:rPr>
+              <w:t>settings/permissions</w:t>
+            </w:r>
+            <w:r>
+              <w:t>, role templates</w:t>
+            </w:r>
+          </w:p>
+        </w:tc>
+        <w:tc>
+          <w:tcPr>
+            <w:tcW w:type="dxa" w:w="1728"/>
+          </w:tcPr>
+          <w:p>
+            <w:r>
+              <w:t>Step 6</w:t>
+            </w:r>
+          </w:p>
+        </w:tc>
+        <w:tc>
+          <w:tcPr>
+            <w:tcW w:type="dxa" w:w="1728"/>
+          </w:tcPr>
+          <w:p>
+            <w:r>
+              <w:t>Req</w:t>
+            </w:r>
+          </w:p>
+        </w:tc>
+        <w:tc>
+          <w:tcPr>
+            <w:tcW w:type="dxa" w:w="1728"/>
+          </w:tcPr>
+          <w:p>
+            <w:r>
+              <w:t>plain-language grouping polish</w:t>
+            </w:r>
+          </w:p>
+        </w:tc>
+      </w:tr>
+      <w:tr>
+        <w:tc>
+          <w:tcPr>
+            <w:tcW w:type="dxa" w:w="1728"/>
+          </w:tcPr>
+          <w:p>
+            <w:r>
+              <w:t>Approval matrix / change requests</w:t>
+            </w:r>
+          </w:p>
+        </w:tc>
+        <w:tc>
+          <w:tcPr>
+            <w:tcW w:type="dxa" w:w="1728"/>
+          </w:tcPr>
+          <w:p>
+            <w:r>
+              <w:rPr>
+                <w:rFonts w:ascii="Consolas" w:hAnsi="Consolas"/>
+                <w:sz w:val="19"/>
+              </w:rPr>
+              <w:t>settings/workflows</w:t>
+            </w:r>
+            <w:r>
+              <w:t xml:space="preserve">, </w:t>
+            </w:r>
+            <w:r>
+              <w:rPr>
+                <w:rFonts w:ascii="Consolas" w:hAnsi="Consolas"/>
+                <w:sz w:val="19"/>
+              </w:rPr>
+              <w:t>approvals</w:t>
+            </w:r>
+            <w:r>
+              <w:t>, change-request engine</w:t>
+            </w:r>
+          </w:p>
+        </w:tc>
+        <w:tc>
+          <w:tcPr>
+            <w:tcW w:type="dxa" w:w="1728"/>
+          </w:tcPr>
+          <w:p>
+            <w:r>
+              <w:t>Step 7 (Advanced)</w:t>
+            </w:r>
+          </w:p>
+        </w:tc>
+        <w:tc>
+          <w:tcPr>
+            <w:tcW w:type="dxa" w:w="1728"/>
+          </w:tcPr>
+          <w:p>
+            <w:r>
+              <w:t>Opt</w:t>
+            </w:r>
+          </w:p>
+        </w:tc>
+        <w:tc>
+          <w:tcPr>
+            <w:tcW w:type="dxa" w:w="1728"/>
+          </w:tcPr>
+          <w:p>
+            <w:r>
+              <w:t>guided "approval matrix" summary view</w:t>
+            </w:r>
+          </w:p>
+        </w:tc>
+      </w:tr>
+      <w:tr>
+        <w:tc>
+          <w:tcPr>
+            <w:tcW w:type="dxa" w:w="1728"/>
+          </w:tcPr>
+          <w:p>
+            <w:r>
+              <w:t>Product hierarchy</w:t>
+            </w:r>
+          </w:p>
+        </w:tc>
+        <w:tc>
+          <w:tcPr>
+            <w:tcW w:type="dxa" w:w="1728"/>
+          </w:tcPr>
+          <w:p>
+            <w:r>
+              <w:t xml:space="preserve">catalog + </w:t>
+            </w:r>
+            <w:r>
+              <w:rPr>
+                <w:rFonts w:ascii="Consolas" w:hAnsi="Consolas"/>
+                <w:sz w:val="19"/>
+              </w:rPr>
+              <w:t>settings/msl</w:t>
+            </w:r>
+            <w:r>
+              <w:t>/</w:t>
+            </w:r>
+            <w:r>
+              <w:rPr>
+                <w:rFonts w:ascii="Consolas" w:hAnsi="Consolas"/>
+                <w:sz w:val="19"/>
+              </w:rPr>
+              <w:t>outlet-grades</w:t>
+            </w:r>
+          </w:p>
+        </w:tc>
+        <w:tc>
+          <w:tcPr>
+            <w:tcW w:type="dxa" w:w="1728"/>
+          </w:tcPr>
+          <w:p>
+            <w:r>
+              <w:t>Step 8</w:t>
+            </w:r>
+          </w:p>
+        </w:tc>
+        <w:tc>
+          <w:tcPr>
+            <w:tcW w:type="dxa" w:w="1728"/>
+          </w:tcPr>
+          <w:p>
+            <w:r>
+              <w:t>Req</w:t>
+            </w:r>
+          </w:p>
+        </w:tc>
+        <w:tc>
+          <w:tcPr>
+            <w:tcW w:type="dxa" w:w="1728"/>
+          </w:tcPr>
+          <w:p>
+            <w:r>
+              <w:t>configurable product-levels UI</w:t>
+            </w:r>
+          </w:p>
+        </w:tc>
+      </w:tr>
+      <w:tr>
+        <w:tc>
+          <w:tcPr>
+            <w:tcW w:type="dxa" w:w="1728"/>
+          </w:tcPr>
+          <w:p>
+            <w:r>
+              <w:t>Multi-UoM</w:t>
+            </w:r>
+          </w:p>
+        </w:tc>
+        <w:tc>
+          <w:tcPr>
+            <w:tcW w:type="dxa" w:w="1728"/>
+          </w:tcPr>
+          <w:p>
+            <w:r>
+              <w:rPr>
+                <w:rFonts w:ascii="Consolas" w:hAnsi="Consolas"/>
+                <w:sz w:val="19"/>
+              </w:rPr>
+              <w:t>settings/uom</w:t>
+            </w:r>
+            <w:r>
+              <w:t xml:space="preserve">, </w:t>
+            </w:r>
+            <w:r>
+              <w:rPr>
+                <w:rFonts w:ascii="Consolas" w:hAnsi="Consolas"/>
+                <w:sz w:val="19"/>
+              </w:rPr>
+              <w:t>erp_product_uoms</w:t>
+            </w:r>
+          </w:p>
+        </w:tc>
+        <w:tc>
+          <w:tcPr>
+            <w:tcW w:type="dxa" w:w="1728"/>
+          </w:tcPr>
+          <w:p>
+            <w:r>
+              <w:t>Step 9 (guided form)</w:t>
+            </w:r>
+          </w:p>
+        </w:tc>
+        <w:tc>
+          <w:tcPr>
+            <w:tcW w:type="dxa" w:w="1728"/>
+          </w:tcPr>
+          <w:p>
+            <w:r>
+              <w:t>Req</w:t>
+            </w:r>
+          </w:p>
+        </w:tc>
+        <w:tc>
+          <w:tcPr>
+            <w:tcW w:type="dxa" w:w="1728"/>
+          </w:tcPr>
+          <w:p>
+            <w:r>
+              <w:t>sentence-style UoM form</w:t>
+            </w:r>
+          </w:p>
+        </w:tc>
+      </w:tr>
+      <w:tr>
+        <w:tc>
+          <w:tcPr>
+            <w:tcW w:type="dxa" w:w="1728"/>
+          </w:tcPr>
+          <w:p>
+            <w:r>
+              <w:t>Data import</w:t>
+            </w:r>
+          </w:p>
+        </w:tc>
+        <w:tc>
+          <w:tcPr>
+            <w:tcW w:type="dxa" w:w="1728"/>
+          </w:tcPr>
+          <w:p>
+            <w:r>
+              <w:rPr>
+                <w:rFonts w:ascii="Consolas" w:hAnsi="Consolas"/>
+                <w:sz w:val="19"/>
+              </w:rPr>
+              <w:t>settings/import</w:t>
+            </w:r>
+            <w:r>
+              <w:t xml:space="preserve">, </w:t>
+            </w:r>
+            <w:r>
+              <w:rPr>
+                <w:rFonts w:ascii="Consolas" w:hAnsi="Consolas"/>
+                <w:sz w:val="19"/>
+              </w:rPr>
+              <w:t>settings/data-onboarding</w:t>
+            </w:r>
+          </w:p>
+        </w:tc>
+        <w:tc>
+          <w:tcPr>
+            <w:tcW w:type="dxa" w:w="1728"/>
+          </w:tcPr>
+          <w:p>
+            <w:r>
+              <w:t>Step 10 (embed)</w:t>
+            </w:r>
+          </w:p>
+        </w:tc>
+        <w:tc>
+          <w:tcPr>
+            <w:tcW w:type="dxa" w:w="1728"/>
+          </w:tcPr>
+          <w:p>
+            <w:r>
+              <w:t>Req</w:t>
+            </w:r>
+          </w:p>
+        </w:tc>
+        <w:tc>
+          <w:tcPr>
+            <w:tcW w:type="dxa" w:w="1728"/>
+          </w:tcPr>
+          <w:p>
+            <w:r>
+              <w:t>reuse as-is</w:t>
+            </w:r>
+          </w:p>
+        </w:tc>
+      </w:tr>
+      <w:tr>
+        <w:tc>
+          <w:tcPr>
+            <w:tcW w:type="dxa" w:w="1728"/>
+          </w:tcPr>
+          <w:p>
+            <w:r>
+              <w:t>Territory / routes / journey</w:t>
+            </w:r>
+          </w:p>
+        </w:tc>
+        <w:tc>
+          <w:tcPr>
+            <w:tcW w:type="dxa" w:w="1728"/>
+          </w:tcPr>
+          <w:p>
+            <w:r>
+              <w:rPr>
+                <w:rFonts w:ascii="Consolas" w:hAnsi="Consolas"/>
+                <w:sz w:val="19"/>
+              </w:rPr>
+              <w:t>territory</w:t>
+            </w:r>
+            <w:r>
+              <w:t xml:space="preserve">, </w:t>
+            </w:r>
+            <w:r>
+              <w:rPr>
+                <w:rFonts w:ascii="Consolas" w:hAnsi="Consolas"/>
+                <w:sz w:val="19"/>
+              </w:rPr>
+              <w:t>distribution/routes</w:t>
+            </w:r>
+            <w:r>
+              <w:t xml:space="preserve">, </w:t>
+            </w:r>
+            <w:r>
+              <w:rPr>
+                <w:rFonts w:ascii="Consolas" w:hAnsi="Consolas"/>
+                <w:sz w:val="19"/>
+              </w:rPr>
+              <w:t>field/journey</w:t>
+            </w:r>
+          </w:p>
+        </w:tc>
+        <w:tc>
+          <w:tcPr>
+            <w:tcW w:type="dxa" w:w="1728"/>
+          </w:tcPr>
+          <w:p>
+            <w:r>
+              <w:t>Step 11</w:t>
+            </w:r>
+          </w:p>
+        </w:tc>
+        <w:tc>
+          <w:tcPr>
+            <w:tcW w:type="dxa" w:w="1728"/>
+          </w:tcPr>
+          <w:p>
+            <w:r>
+              <w:t>Opt</w:t>
+            </w:r>
+          </w:p>
+        </w:tc>
+        <w:tc>
+          <w:tcPr>
+            <w:tcW w:type="dxa" w:w="1728"/>
+          </w:tcPr>
+          <w:p>
+            <w:r>
+              <w:t>reuse; optional for some templates</w:t>
+            </w:r>
+          </w:p>
+        </w:tc>
+      </w:tr>
+      <w:tr>
+        <w:tc>
+          <w:tcPr>
+            <w:tcW w:type="dxa" w:w="1728"/>
+          </w:tcPr>
+          <w:p>
+            <w:r>
+              <w:t>Tax / VAT / currency</w:t>
+            </w:r>
+          </w:p>
+        </w:tc>
+        <w:tc>
+          <w:tcPr>
+            <w:tcW w:type="dxa" w:w="1728"/>
+          </w:tcPr>
+          <w:p>
+            <w:r>
+              <w:rPr>
+                <w:rFonts w:ascii="Consolas" w:hAnsi="Consolas"/>
+                <w:sz w:val="19"/>
+              </w:rPr>
+              <w:t>settings/einvoice</w:t>
+            </w:r>
+            <w:r>
+              <w:t xml:space="preserve">, </w:t>
+            </w:r>
+            <w:r>
+              <w:rPr>
+                <w:rFonts w:ascii="Consolas" w:hAnsi="Consolas"/>
+                <w:sz w:val="19"/>
+              </w:rPr>
+              <w:t>lib/tax/*</w:t>
+            </w:r>
+            <w:r>
+              <w:t>, company currency</w:t>
+            </w:r>
+          </w:p>
+        </w:tc>
+        <w:tc>
+          <w:tcPr>
+            <w:tcW w:type="dxa" w:w="1728"/>
+          </w:tcPr>
+          <w:p>
+            <w:r>
+              <w:t>Step 12 (Advanced)</w:t>
+            </w:r>
+          </w:p>
+        </w:tc>
+        <w:tc>
+          <w:tcPr>
+            <w:tcW w:type="dxa" w:w="1728"/>
+          </w:tcPr>
+          <w:p>
+            <w:r>
+              <w:t>Opt</w:t>
+            </w:r>
+          </w:p>
+        </w:tc>
+        <w:tc>
+          <w:tcPr>
+            <w:tcW w:type="dxa" w:w="1728"/>
+          </w:tcPr>
+          <w:p>
+            <w:r>
+              <w:t xml:space="preserve">company tax/currency </w:t>
+            </w:r>
+            <w:r>
+              <w:rPr>
+                <w:b/>
+              </w:rPr>
+              <w:t>settings screen</w:t>
+            </w:r>
+          </w:p>
+        </w:tc>
+      </w:tr>
+      <w:tr>
+        <w:tc>
+          <w:tcPr>
+            <w:tcW w:type="dxa" w:w="1728"/>
+          </w:tcPr>
+          <w:p>
+            <w:r>
+              <w:t>Document numbering</w:t>
+            </w:r>
+          </w:p>
+        </w:tc>
+        <w:tc>
+          <w:tcPr>
+            <w:tcW w:type="dxa" w:w="1728"/>
+          </w:tcPr>
+          <w:p>
+            <w:r>
+              <w:rPr>
+                <w:rFonts w:ascii="Consolas" w:hAnsi="Consolas"/>
+                <w:sz w:val="19"/>
+              </w:rPr>
+              <w:t>erp_sequences</w:t>
+            </w:r>
+            <w:r>
+              <w:t xml:space="preserve"> (auto)</w:t>
+            </w:r>
+          </w:p>
+        </w:tc>
+        <w:tc>
+          <w:tcPr>
+            <w:tcW w:type="dxa" w:w="1728"/>
+          </w:tcPr>
+          <w:p>
+            <w:r>
+              <w:t>Step 13 (Advanced)</w:t>
+            </w:r>
+          </w:p>
+        </w:tc>
+        <w:tc>
+          <w:tcPr>
+            <w:tcW w:type="dxa" w:w="1728"/>
+          </w:tcPr>
+          <w:p>
+            <w:r>
+              <w:t>Opt</w:t>
+            </w:r>
+          </w:p>
+        </w:tc>
+        <w:tc>
+          <w:tcPr>
+            <w:tcW w:type="dxa" w:w="1728"/>
+          </w:tcPr>
+          <w:p>
+            <w:r>
+              <w:rPr>
+                <w:b/>
+              </w:rPr>
+              <w:t>numbering config UI (new)</w:t>
+            </w:r>
+          </w:p>
+        </w:tc>
+      </w:tr>
+      <w:tr>
+        <w:tc>
+          <w:tcPr>
+            <w:tcW w:type="dxa" w:w="1728"/>
+          </w:tcPr>
+          <w:p>
+            <w:r>
+              <w:t>Integrations</w:t>
+            </w:r>
+          </w:p>
+        </w:tc>
+        <w:tc>
+          <w:tcPr>
+            <w:tcW w:type="dxa" w:w="1728"/>
+          </w:tcPr>
+          <w:p>
+            <w:r>
+              <w:rPr>
+                <w:rFonts w:ascii="Consolas" w:hAnsi="Consolas"/>
+                <w:sz w:val="19"/>
+              </w:rPr>
+              <w:t>settings/integrations(/*)</w:t>
+            </w:r>
+            <w:r>
+              <w:t xml:space="preserve">, </w:t>
+            </w:r>
+            <w:r>
+              <w:rPr>
+                <w:rFonts w:ascii="Consolas" w:hAnsi="Consolas"/>
+                <w:sz w:val="19"/>
+              </w:rPr>
+              <w:t>integration-hub</w:t>
+            </w:r>
+          </w:p>
+        </w:tc>
+        <w:tc>
+          <w:tcPr>
+            <w:tcW w:type="dxa" w:w="1728"/>
+          </w:tcPr>
+          <w:p>
+            <w:r>
+              <w:t>Step 14 (Advanced)</w:t>
+            </w:r>
+          </w:p>
+        </w:tc>
+        <w:tc>
+          <w:tcPr>
+            <w:tcW w:type="dxa" w:w="1728"/>
+          </w:tcPr>
+          <w:p>
+            <w:r>
+              <w:t>Opt</w:t>
+            </w:r>
+          </w:p>
+        </w:tc>
+        <w:tc>
+          <w:tcPr>
+            <w:tcW w:type="dxa" w:w="1728"/>
+          </w:tcPr>
+          <w:p>
+            <w:r>
+              <w:t>reuse as-is</w:t>
+            </w:r>
+          </w:p>
+        </w:tc>
+      </w:tr>
+      <w:tr>
+        <w:tc>
+          <w:tcPr>
+            <w:tcW w:type="dxa" w:w="1728"/>
+          </w:tcPr>
+          <w:p>
+            <w:r>
+              <w:t>Users</w:t>
+            </w:r>
+          </w:p>
+        </w:tc>
+        <w:tc>
+          <w:tcPr>
+            <w:tcW w:type="dxa" w:w="1728"/>
+          </w:tcPr>
+          <w:p>
+            <w:r>
+              <w:rPr>
+                <w:rFonts w:ascii="Consolas" w:hAnsi="Consolas"/>
+                <w:sz w:val="19"/>
+              </w:rPr>
+              <w:t>settings/users</w:t>
+            </w:r>
+            <w:r>
+              <w:t xml:space="preserve">, </w:t>
+            </w:r>
+            <w:r>
+              <w:rPr>
+                <w:rFonts w:ascii="Consolas" w:hAnsi="Consolas"/>
+                <w:sz w:val="19"/>
+              </w:rPr>
+              <w:t>staff</w:t>
+            </w:r>
+            <w:r>
+              <w:t>, import</w:t>
+            </w:r>
+          </w:p>
+        </w:tc>
+        <w:tc>
+          <w:tcPr>
+            <w:tcW w:type="dxa" w:w="1728"/>
+          </w:tcPr>
+          <w:p>
+            <w:r>
+              <w:t>Step 15</w:t>
+            </w:r>
+          </w:p>
+        </w:tc>
+        <w:tc>
+          <w:tcPr>
+            <w:tcW w:type="dxa" w:w="1728"/>
+          </w:tcPr>
+          <w:p>
+            <w:r>
+              <w:t>Req</w:t>
+            </w:r>
+          </w:p>
+        </w:tc>
+        <w:tc>
+          <w:tcPr>
+            <w:tcW w:type="dxa" w:w="1728"/>
+          </w:tcPr>
+          <w:p>
+            <w:r>
+              <w:t>reuse + invite flow</w:t>
+            </w:r>
+          </w:p>
+        </w:tc>
+      </w:tr>
+      <w:tr>
+        <w:tc>
+          <w:tcPr>
+            <w:tcW w:type="dxa" w:w="1728"/>
+          </w:tcPr>
+          <w:p>
+            <w:r>
+              <w:t>Dashboards</w:t>
+            </w:r>
+          </w:p>
+        </w:tc>
+        <w:tc>
+          <w:tcPr>
+            <w:tcW w:type="dxa" w:w="1728"/>
+          </w:tcPr>
+          <w:p>
+            <w:r>
+              <w:rPr>
+                <w:rFonts w:ascii="Consolas" w:hAnsi="Consolas"/>
+                <w:sz w:val="19"/>
+              </w:rPr>
+              <w:t>dashboard</w:t>
+            </w:r>
+            <w:r>
+              <w:t>, vertical dashboards, modules</w:t>
+            </w:r>
+          </w:p>
+        </w:tc>
+        <w:tc>
+          <w:tcPr>
+            <w:tcW w:type="dxa" w:w="1728"/>
+          </w:tcPr>
+          <w:p>
+            <w:r>
+              <w:t>Step 16</w:t>
+            </w:r>
+          </w:p>
+        </w:tc>
+        <w:tc>
+          <w:tcPr>
+            <w:tcW w:type="dxa" w:w="1728"/>
+          </w:tcPr>
+          <w:p>
+            <w:r>
+              <w:t>Req</w:t>
+            </w:r>
+          </w:p>
+        </w:tc>
+        <w:tc>
+          <w:tcPr>
+            <w:tcW w:type="dxa" w:w="1728"/>
+          </w:tcPr>
+          <w:p>
+            <w:r>
+              <w:t>pick default dashboards</w:t>
+            </w:r>
+          </w:p>
+        </w:tc>
+      </w:tr>
+    </w:tbl>
+    <w:p/>
+    <w:p>
+      <w:pPr>
+        <w:pStyle w:val="Heading2"/>
+      </w:pPr>
+      <w:r>
+        <w:rPr>
+          <w:color w:val="1F497D"/>
+        </w:rPr>
+        <w:t>5. Template Differences (how onboarding changes per template)</w:t>
+      </w:r>
+    </w:p>
+    <w:tbl>
+      <w:tblPr>
+        <w:tblStyle w:val="LightGrid-Accent1"/>
+        <w:tblW w:type="auto" w:w="0"/>
+        <w:jc w:val="center"/>
+        <w:tblLook w:firstColumn="1" w:firstRow="1" w:lastColumn="0" w:lastRow="0" w:noHBand="0" w:noVBand="1" w:val="04A0"/>
+      </w:tblPr>
+      <w:tblGrid>
+        <w:gridCol w:w="1728"/>
+        <w:gridCol w:w="1728"/>
+        <w:gridCol w:w="1728"/>
+        <w:gridCol w:w="1728"/>
+        <w:gridCol w:w="1728"/>
+      </w:tblGrid>
+      <w:tr>
+        <w:tc>
+          <w:tcPr>
+            <w:tcW w:type="dxa" w:w="1728"/>
+            <w:shd w:val="clear" w:fill="1F497D"/>
+          </w:tcPr>
+          <w:p>
+            <w:r>
+              <w:rPr>
+                <w:b/>
+                <w:color w:val="FFFFFF"/>
+              </w:rPr>
+              <w:t>Template</w:t>
+            </w:r>
+          </w:p>
+        </w:tc>
+        <w:tc>
+          <w:tcPr>
+            <w:tcW w:type="dxa" w:w="1728"/>
+            <w:shd w:val="clear" w:fill="1F497D"/>
+          </w:tcPr>
+          <w:p>
+            <w:r>
+              <w:rPr>
+                <w:b/>
+                <w:color w:val="FFFFFF"/>
+              </w:rPr>
+              <w:t>Operating model</w:t>
+            </w:r>
+          </w:p>
+        </w:tc>
+        <w:tc>
+          <w:tcPr>
+            <w:tcW w:type="dxa" w:w="1728"/>
+            <w:shd w:val="clear" w:fill="1F497D"/>
+          </w:tcPr>
+          <w:p>
+            <w:r>
+              <w:rPr>
+                <w:b/>
+                <w:color w:val="FFFFFF"/>
+              </w:rPr>
+              <w:t>Steps emphasized</w:t>
+            </w:r>
+          </w:p>
+        </w:tc>
+        <w:tc>
+          <w:tcPr>
+            <w:tcW w:type="dxa" w:w="1728"/>
+            <w:shd w:val="clear" w:fill="1F497D"/>
+          </w:tcPr>
+          <w:p>
+            <w:r>
+              <w:rPr>
+                <w:b/>
+                <w:color w:val="FFFFFF"/>
+              </w:rPr>
+              <w:t>Defaults seeded</w:t>
+            </w:r>
+          </w:p>
+        </w:tc>
+        <w:tc>
+          <w:tcPr>
+            <w:tcW w:type="dxa" w:w="1728"/>
+            <w:shd w:val="clear" w:fill="1F497D"/>
+          </w:tcPr>
+          <w:p>
+            <w:r>
+              <w:rPr>
+                <w:b/>
+                <w:color w:val="FFFFFF"/>
+              </w:rPr>
+              <w:t>Steps hidden/optional</w:t>
+            </w:r>
+          </w:p>
+        </w:tc>
+      </w:tr>
+      <w:tr>
+        <w:tc>
+          <w:tcPr>
+            <w:tcW w:type="dxa" w:w="1728"/>
+          </w:tcPr>
+          <w:p>
+            <w:r>
+              <w:rPr>
+                <w:b/>
+              </w:rPr>
+              <w:t>FMCG Cash Van</w:t>
+            </w:r>
+          </w:p>
+        </w:tc>
+        <w:tc>
+          <w:tcPr>
+            <w:tcW w:type="dxa" w:w="1728"/>
+          </w:tcPr>
+          <w:p>
+            <w:r>
+              <w:t>Sell + collect from the van</w:t>
+            </w:r>
+          </w:p>
+        </w:tc>
+        <w:tc>
+          <w:tcPr>
+            <w:tcW w:type="dxa" w:w="1728"/>
+          </w:tcPr>
+          <w:p>
+            <w:r>
+              <w:t>Org→Reporting→</w:t>
+            </w:r>
+            <w:r>
+              <w:rPr>
+                <w:b/>
+              </w:rPr>
+              <w:t>Routes/Journey</w:t>
+            </w:r>
+            <w:r>
+              <w:t>→Products→UoM→Van load/opening balance</w:t>
+            </w:r>
+          </w:p>
+        </w:tc>
+        <w:tc>
+          <w:tcPr>
+            <w:tcW w:type="dxa" w:w="1728"/>
+          </w:tcPr>
+          <w:p>
+            <w:r>
+              <w:t>van-sales workflow, Cash-Van approval template, Unit/Pack/Carton</w:t>
+            </w:r>
+          </w:p>
+        </w:tc>
+        <w:tc>
+          <w:tcPr>
+            <w:tcW w:type="dxa" w:w="1728"/>
+          </w:tcPr>
+          <w:p>
+            <w:r>
+              <w:t>Pre-sales delivery scheduling</w:t>
+            </w:r>
+          </w:p>
+        </w:tc>
+      </w:tr>
+      <w:tr>
+        <w:tc>
+          <w:tcPr>
+            <w:tcW w:type="dxa" w:w="1728"/>
+          </w:tcPr>
+          <w:p>
+            <w:r>
+              <w:rPr>
+                <w:b/>
+              </w:rPr>
+              <w:t>FMCG Standard / Pre-Sales</w:t>
+            </w:r>
+          </w:p>
+        </w:tc>
+        <w:tc>
+          <w:tcPr>
+            <w:tcW w:type="dxa" w:w="1728"/>
+          </w:tcPr>
+          <w:p>
+            <w:r>
+              <w:t>Order now, deliver later</w:t>
+            </w:r>
+          </w:p>
+        </w:tc>
+        <w:tc>
+          <w:tcPr>
+            <w:tcW w:type="dxa" w:w="1728"/>
+          </w:tcPr>
+          <w:p>
+            <w:r>
+              <w:t>Org→Reporting→</w:t>
+            </w:r>
+            <w:r>
+              <w:rPr>
+                <w:b/>
+              </w:rPr>
+              <w:t>Routes/Journey</w:t>
+            </w:r>
+            <w:r>
+              <w:t>→Products→</w:t>
+            </w:r>
+            <w:r>
+              <w:rPr>
+                <w:b/>
+              </w:rPr>
+              <w:t>Credit/terms approval</w:t>
+            </w:r>
+          </w:p>
+        </w:tc>
+        <w:tc>
+          <w:tcPr>
+            <w:tcW w:type="dxa" w:w="1728"/>
+          </w:tcPr>
+          <w:p>
+            <w:r>
+              <w:t>pre-sales workflow, delivery step, credit approvals</w:t>
+            </w:r>
+          </w:p>
+        </w:tc>
+        <w:tc>
+          <w:tcPr>
+            <w:tcW w:type="dxa" w:w="1728"/>
+          </w:tcPr>
+          <w:p>
+            <w:r>
+              <w:t>Van opening balance</w:t>
+            </w:r>
+          </w:p>
+        </w:tc>
+      </w:tr>
+      <w:tr>
+        <w:tc>
+          <w:tcPr>
+            <w:tcW w:type="dxa" w:w="1728"/>
+          </w:tcPr>
+          <w:p>
+            <w:r>
+              <w:rPr>
+                <w:b/>
+              </w:rPr>
+              <w:t>Distribution</w:t>
+            </w:r>
+          </w:p>
+        </w:tc>
+        <w:tc>
+          <w:tcPr>
+            <w:tcW w:type="dxa" w:w="1728"/>
+          </w:tcPr>
+          <w:p>
+            <w:r>
+              <w:t>Multi-branch supply + suppliers</w:t>
+            </w:r>
+          </w:p>
+        </w:tc>
+        <w:tc>
+          <w:tcPr>
+            <w:tcW w:type="dxa" w:w="1728"/>
+          </w:tcPr>
+          <w:p>
+            <w:r>
+              <w:t>Org(Region→Branch)→</w:t>
+            </w:r>
+            <w:r>
+              <w:rPr>
+                <w:b/>
+              </w:rPr>
+              <w:t>Suppliers/Purchasing</w:t>
+            </w:r>
+            <w:r>
+              <w:t>→Products→Routes→Tax</w:t>
+            </w:r>
+          </w:p>
+        </w:tc>
+        <w:tc>
+          <w:tcPr>
+            <w:tcW w:type="dxa" w:w="1728"/>
+          </w:tcPr>
+          <w:p>
+            <w:r>
+              <w:t>supplier import, purchasing module, pallet UoM</w:t>
+            </w:r>
+          </w:p>
+        </w:tc>
+        <w:tc>
+          <w:tcPr>
+            <w:tcW w:type="dxa" w:w="1728"/>
+          </w:tcPr>
+          <w:p>
+            <w:r>
+              <w:t>Field journey (optional)</w:t>
+            </w:r>
+          </w:p>
+        </w:tc>
+      </w:tr>
+      <w:tr>
+        <w:tc>
+          <w:tcPr>
+            <w:tcW w:type="dxa" w:w="1728"/>
+          </w:tcPr>
+          <w:p>
+            <w:r>
+              <w:rPr>
+                <w:b/>
+              </w:rPr>
+              <w:t>Pharmacy</w:t>
+            </w:r>
+          </w:p>
+        </w:tc>
+        <w:tc>
+          <w:tcPr>
+            <w:tcW w:type="dxa" w:w="1728"/>
+          </w:tcPr>
+          <w:p>
+            <w:r>
+              <w:t>Dispensing + batches</w:t>
+            </w:r>
+          </w:p>
+        </w:tc>
+        <w:tc>
+          <w:tcPr>
+            <w:tcW w:type="dxa" w:w="1728"/>
+          </w:tcPr>
+          <w:p>
+            <w:r>
+              <w:t>Org(Branch)→Products(</w:t>
+            </w:r>
+            <w:r>
+              <w:rPr>
+                <w:b/>
+              </w:rPr>
+              <w:t>Generic→Brand</w:t>
+            </w:r>
+            <w:r>
+              <w:t>)→</w:t>
+            </w:r>
+            <w:r>
+              <w:rPr>
+                <w:b/>
+              </w:rPr>
+              <w:t>Batches/expiry</w:t>
+            </w:r>
+            <w:r>
+              <w:t>→Tax</w:t>
+            </w:r>
+          </w:p>
+        </w:tc>
+        <w:tc>
+          <w:tcPr>
+            <w:tcW w:type="dxa" w:w="1728"/>
+          </w:tcPr>
+          <w:p>
+            <w:r>
+              <w:t xml:space="preserve">pharmacy workflow (reuse </w:t>
+            </w:r>
+            <w:r>
+              <w:rPr>
+                <w:rFonts w:ascii="Consolas" w:hAnsi="Consolas"/>
+                <w:sz w:val="19"/>
+              </w:rPr>
+              <w:t>pharmacy/onboarding</w:t>
+            </w:r>
+            <w:r>
+              <w:t>), strip/box UoM</w:t>
+            </w:r>
+          </w:p>
+        </w:tc>
+        <w:tc>
+          <w:tcPr>
+            <w:tcW w:type="dxa" w:w="1728"/>
+          </w:tcPr>
+          <w:p>
+            <w:r>
+              <w:t>Routes/journey</w:t>
+            </w:r>
+          </w:p>
+        </w:tc>
+      </w:tr>
+      <w:tr>
+        <w:tc>
+          <w:tcPr>
+            <w:tcW w:type="dxa" w:w="1728"/>
+          </w:tcPr>
+          <w:p>
+            <w:r>
+              <w:rPr>
+                <w:b/>
+              </w:rPr>
+              <w:t>Retail / POS</w:t>
+            </w:r>
+          </w:p>
+        </w:tc>
+        <w:tc>
+          <w:tcPr>
+            <w:tcW w:type="dxa" w:w="1728"/>
+          </w:tcPr>
+          <w:p>
+            <w:r>
+              <w:t>Store checkout</w:t>
+            </w:r>
+          </w:p>
+        </w:tc>
+        <w:tc>
+          <w:tcPr>
+            <w:tcW w:type="dxa" w:w="1728"/>
+          </w:tcPr>
+          <w:p>
+            <w:r>
+              <w:t>Org(Store)→Products(Dept→Category)→</w:t>
+            </w:r>
+            <w:r>
+              <w:rPr>
+                <w:b/>
+              </w:rPr>
+              <w:t>POS/cashbox</w:t>
+            </w:r>
+            <w:r>
+              <w:t>→Tax</w:t>
+            </w:r>
+          </w:p>
+        </w:tc>
+        <w:tc>
+          <w:tcPr>
+            <w:tcW w:type="dxa" w:w="1728"/>
+          </w:tcPr>
+          <w:p>
+            <w:r>
+              <w:t>retail/POS workflow, each/pack UoM</w:t>
+            </w:r>
+          </w:p>
+        </w:tc>
+        <w:tc>
+          <w:tcPr>
+            <w:tcW w:type="dxa" w:w="1728"/>
+          </w:tcPr>
+          <w:p>
+            <w:r>
+              <w:t>Routes, journey, pre-sales</w:t>
+            </w:r>
+          </w:p>
+        </w:tc>
+      </w:tr>
+      <w:tr>
+        <w:tc>
+          <w:tcPr>
+            <w:tcW w:type="dxa" w:w="1728"/>
+          </w:tcPr>
+          <w:p>
+            <w:r>
+              <w:rPr>
+                <w:b/>
+              </w:rPr>
+              <w:t>Custom</w:t>
+            </w:r>
+          </w:p>
+        </w:tc>
+        <w:tc>
+          <w:tcPr>
+            <w:tcW w:type="dxa" w:w="1728"/>
+          </w:tcPr>
+          <w:p>
+            <w:r>
+              <w:t>Admin-defined</w:t>
+            </w:r>
+          </w:p>
+        </w:tc>
+        <w:tc>
+          <w:tcPr>
+            <w:tcW w:type="dxa" w:w="1728"/>
+          </w:tcPr>
+          <w:p>
+            <w:r>
+              <w:t>Blank levels; all steps available</w:t>
+            </w:r>
+          </w:p>
+        </w:tc>
+        <w:tc>
+          <w:tcPr>
+            <w:tcW w:type="dxa" w:w="1728"/>
+          </w:tcPr>
+          <w:p>
+            <w:r>
+              <w:t>none (build from scratch)</w:t>
+            </w:r>
+          </w:p>
+        </w:tc>
+        <w:tc>
+          <w:tcPr>
+            <w:tcW w:type="dxa" w:w="1728"/>
+          </w:tcPr>
+          <w:p>
+            <w:r>
+              <w:t>none</w:t>
+            </w:r>
+          </w:p>
+        </w:tc>
+      </w:tr>
+    </w:tbl>
+    <w:p/>
+    <w:p>
+      <w:r>
+        <w:t>Template choice (Step 2) **pre-selects modules, workflow template, role set, product</w:t>
+      </w:r>
+    </w:p>
+    <w:p>
+      <w:r>
+        <w:t>levels, and UoM presets**, then the admin edits — minimizing steps per vertical.</w:t>
+      </w:r>
+    </w:p>
+    <w:p>
+      <w:pPr>
+        <w:pStyle w:val="Heading2"/>
+      </w:pPr>
+      <w:r>
+        <w:rPr>
+          <w:color w:val="1F497D"/>
+        </w:rPr>
+        <w:t>6. Implementation Readiness</w:t>
+      </w:r>
+    </w:p>
+    <w:p>
+      <w:pPr>
+        <w:pStyle w:val="ListBullet"/>
+      </w:pPr>
+      <w:r>
+        <w:rPr>
+          <w:b/>
+        </w:rPr>
+        <w:t>Wire immediately (existing engine + screen — embed/deep-link):</w:t>
+      </w:r>
+      <w:r>
+        <w:t xml:space="preserve"> Company Basics,</w:t>
+      </w:r>
+    </w:p>
+    <w:p>
+      <w:r>
+        <w:t>Industry/Modules (setup-wizard), Workflow templates, Roles &amp; permissions, Multi-UoM,</w:t>
+      </w:r>
+    </w:p>
+    <w:p>
+      <w:r>
+        <w:t>Data Import, Integrations, Suppliers, Territory/Routes/Journey, Approvals/Change</w:t>
+      </w:r>
+    </w:p>
+    <w:p>
+      <w:r>
+        <w:t>Requests, Credit/terms &amp; closure/reactivation approvals, Users, Dashboards, Reporting</w:t>
+      </w:r>
+    </w:p>
+    <w:p>
+      <w:r>
+        <w:t>(</w:t>
+      </w:r>
+      <w:r>
+        <w:rPr>
+          <w:rFonts w:ascii="Consolas" w:hAnsi="Consolas"/>
+          <w:sz w:val="19"/>
+        </w:rPr>
+        <w:t>reports_to</w:t>
+      </w:r>
+      <w:r>
+        <w:t xml:space="preserve"> data exists; frozen subtree).</w:t>
+      </w:r>
+    </w:p>
+    <w:p>
+      <w:pPr>
+        <w:pStyle w:val="ListBullet"/>
+      </w:pPr>
+      <w:r>
+        <w:rPr>
+          <w:b/>
+        </w:rPr>
+        <w:t>Needs only UI exposure (engine exists, build a friendlier/visual screen):</w:t>
+      </w:r>
+      <w:r>
+        <w:t xml:space="preserve"> Org-chart</w:t>
+      </w:r>
+    </w:p>
+    <w:p>
+      <w:r>
+        <w:t>drag-drop builder, visual reporting tree, configurable product-levels builder,</w:t>
+      </w:r>
+    </w:p>
+    <w:p>
+      <w:r>
+        <w:t>sentence-style UoM form, plain-language role grouping, company **tax/VAT/currency</w:t>
+      </w:r>
+    </w:p>
+    <w:p>
+      <w:r>
+        <w:t>settings</w:t>
+      </w:r>
+      <w:r>
+        <w:rPr>
+          <w:b/>
+        </w:rPr>
+        <w:t xml:space="preserve"> screen, </w:t>
+      </w:r>
+      <w:r>
+        <w:t>document-numbering config** screen, operating-mode (Cash Van /</w:t>
+      </w:r>
+    </w:p>
+    <w:p>
+      <w:r>
+        <w:t>Pre-Sales / Hybrid) selector labels.</w:t>
+      </w:r>
+    </w:p>
+    <w:p>
+      <w:pPr>
+        <w:pStyle w:val="ListBullet"/>
+      </w:pPr>
+      <w:r>
+        <w:rPr>
+          <w:b/>
+        </w:rPr>
+        <w:t>Requires backend work (small):</w:t>
+      </w:r>
+      <w:r>
+        <w:t xml:space="preserve"> </w:t>
+      </w:r>
+      <w:r>
+        <w:rPr>
+          <w:rFonts w:ascii="Consolas" w:hAnsi="Consolas"/>
+          <w:sz w:val="19"/>
+        </w:rPr>
+        <w:t>erp_org_levels/nodes</w:t>
+      </w:r>
+      <w:r>
+        <w:t xml:space="preserve"> + </w:t>
+      </w:r>
+      <w:r>
+        <w:rPr>
+          <w:rFonts w:ascii="Consolas" w:hAnsi="Consolas"/>
+          <w:sz w:val="19"/>
+        </w:rPr>
+        <w:t>erp_product_levels/nodes</w:t>
+      </w:r>
+    </w:p>
+    <w:p>
+      <w:r>
+        <w:t xml:space="preserve">(configurable hierarchy tables), </w:t>
+      </w:r>
+      <w:r>
+        <w:rPr>
+          <w:rFonts w:ascii="Consolas" w:hAnsi="Consolas"/>
+          <w:sz w:val="19"/>
+        </w:rPr>
+        <w:t>erp_onboarding_state</w:t>
+      </w:r>
+      <w:r>
+        <w:t xml:space="preserve"> (wizard resume), numbering-config</w:t>
+      </w:r>
+    </w:p>
+    <w:p>
+      <w:r>
+        <w:t>persistence, opening-stock import mapping for non-van inventory.</w:t>
+      </w:r>
+    </w:p>
+    <w:p>
+      <w:pPr>
+        <w:pStyle w:val="ListBullet"/>
+      </w:pPr>
+      <w:r>
+        <w:rPr>
+          <w:b/>
+        </w:rPr>
+        <w:t>Future roadmap:</w:t>
+      </w:r>
+      <w:r>
+        <w:t xml:space="preserve"> sandbox/preview-before-go-live, full drag-drop org chart with live</w:t>
+      </w:r>
+    </w:p>
+    <w:p>
+      <w:r>
+        <w:t>"who sees what" simulation, industry-template gallery polish, multi-node user assignment.</w:t>
+      </w:r>
+    </w:p>
+    <w:p>
+      <w:pPr>
         <w:pStyle w:val="Heading2"/>
       </w:pPr>
       <w:r>
@@ -2371,22 +5508,73 @@
         <w:t>design only, nothing implemented</w:t>
       </w:r>
       <w:r>
-        <w:t>. Conforms to the frozen</w:t>
+        <w:t>. Now includes the</w:t>
       </w:r>
     </w:p>
     <w:p>
       <w:r>
-        <w:t>Reference Architecture Baseline and Core UX principle. Next design targets (when scheduled):</w:t>
+        <w:rPr>
+          <w:b/>
+        </w:rPr>
+        <w:t>Reuse &amp; Coverage Audit</w:t>
+      </w:r>
+      <w:r>
+        <w:t>, the 17-step Core+Advanced structure mapped to existing</w:t>
       </w:r>
     </w:p>
     <w:p>
       <w:r>
-        <w:t>Organization Structure Builder deep-dive, Product Builder deep-dive, Role Template Builder</w:t>
+        <w:t xml:space="preserve">capabilities, the </w:t>
+      </w:r>
+      <w:r>
+        <w:rPr>
+          <w:b/>
+        </w:rPr>
+        <w:t>Existing Platform Reuse Map</w:t>
+      </w:r>
+      <w:r>
+        <w:t xml:space="preserve">, </w:t>
+      </w:r>
+      <w:r>
+        <w:rPr>
+          <w:b/>
+        </w:rPr>
+        <w:t>Template Differences</w:t>
+      </w:r>
+      <w:r>
+        <w:t>, and</w:t>
       </w:r>
     </w:p>
     <w:p>
       <w:r>
-        <w:t>deep-dive.</w:t>
+        <w:rPr>
+          <w:b/>
+        </w:rPr>
+        <w:t>Implementation Readiness</w:t>
+      </w:r>
+      <w:r>
+        <w:t>. Conforms to the frozen Reference Architecture Baseline and</w:t>
+      </w:r>
+    </w:p>
+    <w:p>
+      <w:r>
+        <w:t xml:space="preserve">Core UX principle. The onboarding wizard </w:t>
+      </w:r>
+      <w:r>
+        <w:rPr>
+          <w:b/>
+        </w:rPr>
+        <w:t>reuses and exposes existing engines/screens</w:t>
+      </w:r>
+    </w:p>
+    <w:p>
+      <w:r>
+        <w:t>rather than rebuilding them. Next design deep-dives (when scheduled): Org Structure</w:t>
+      </w:r>
+    </w:p>
+    <w:p>
+      <w:r>
+        <w:t>Builder, Product Builder, Role Template Builder.</w:t>
       </w:r>
     </w:p>
     <w:sectPr>

</xml_diff>